<commit_message>
Agragados talleres html1 y html2
</commit_message>
<xml_diff>
--- a/SENA/Web/Talleres/2 Conocimientos HTMl5.docx
+++ b/SENA/Web/Talleres/2 Conocimientos HTMl5.docx
@@ -1,6 +1,6 @@
 
 <file path=word/document.xml><?xml version="1.0" encoding="utf-8"?>
-<w:document xmlns:wpc="http://schemas.microsoft.com/office/word/2010/wordprocessingCanvas" xmlns:cx="http://schemas.microsoft.com/office/drawing/2014/chartex" xmlns:cx1="http://schemas.microsoft.com/office/drawing/2015/9/8/chartex" xmlns:cx2="http://schemas.microsoft.com/office/drawing/2015/10/21/chartex" xmlns:cx3="http://schemas.microsoft.com/office/drawing/2016/5/9/chartex" xmlns:cx4="http://schemas.microsoft.com/office/drawing/2016/5/10/chartex" xmlns:cx5="http://schemas.microsoft.com/office/drawing/2016/5/11/chartex" xmlns:cx6="http://schemas.microsoft.com/office/drawing/2016/5/12/chartex" xmlns:cx7="http://schemas.microsoft.com/office/drawing/2016/5/13/chartex" xmlns:cx8="http://schemas.microsoft.com/office/drawing/2016/5/14/chartex" xmlns:mc="http://schemas.openxmlformats.org/markup-compatibility/2006" xmlns:aink="http://schemas.microsoft.com/office/drawing/2016/ink" xmlns:am3d="http://schemas.microsoft.com/office/drawing/2017/model3d" xmlns:o="urn:schemas-microsoft-com:office:office" xmlns:r="http://schemas.openxmlformats.org/officeDocument/2006/relationships" xmlns:m="http://schemas.openxmlformats.org/officeDocument/2006/math" xmlns:v="urn:schemas-microsoft-com:vml" xmlns:wp14="http://schemas.microsoft.com/office/word/2010/wordprocessingDrawing" xmlns:wp="http://schemas.openxmlformats.org/drawingml/2006/wordprocessingDrawing" xmlns:w10="urn:schemas-microsoft-com:office:word" xmlns:w="http://schemas.openxmlformats.org/wordprocessingml/2006/main" xmlns:w14="http://schemas.microsoft.com/office/word/2010/wordml" xmlns:w15="http://schemas.microsoft.com/office/word/2012/wordml" xmlns:w16cex="http://schemas.microsoft.com/office/word/2018/wordml/cex" xmlns:w16cid="http://schemas.microsoft.com/office/word/2016/wordml/cid" xmlns:w16="http://schemas.microsoft.com/office/word/2018/wordml" xmlns:w16sdtdh="http://schemas.microsoft.com/office/word/2020/wordml/sdtdatahash" xmlns:w16se="http://schemas.microsoft.com/office/word/2015/wordml/symex" xmlns:wpg="http://schemas.microsoft.com/office/word/2010/wordprocessingGroup" xmlns:wpi="http://schemas.microsoft.com/office/word/2010/wordprocessingInk" xmlns:wne="http://schemas.microsoft.com/office/word/2006/wordml" xmlns:wps="http://schemas.microsoft.com/office/word/2010/wordprocessingShape" mc:Ignorable="w14 w15 w16se w16cid w16 w16cex w16sdtdh wp14">
+<w:document xmlns:wpc="http://schemas.microsoft.com/office/word/2010/wordprocessingCanvas" xmlns:cx="http://schemas.microsoft.com/office/drawing/2014/chartex" xmlns:cx1="http://schemas.microsoft.com/office/drawing/2015/9/8/chartex" xmlns:cx2="http://schemas.microsoft.com/office/drawing/2015/10/21/chartex" xmlns:cx3="http://schemas.microsoft.com/office/drawing/2016/5/9/chartex" xmlns:cx4="http://schemas.microsoft.com/office/drawing/2016/5/10/chartex" xmlns:cx5="http://schemas.microsoft.com/office/drawing/2016/5/11/chartex" xmlns:cx6="http://schemas.microsoft.com/office/drawing/2016/5/12/chartex" xmlns:cx7="http://schemas.microsoft.com/office/drawing/2016/5/13/chartex" xmlns:cx8="http://schemas.microsoft.com/office/drawing/2016/5/14/chartex" xmlns:mc="http://schemas.openxmlformats.org/markup-compatibility/2006" xmlns:aink="http://schemas.microsoft.com/office/drawing/2016/ink" xmlns:am3d="http://schemas.microsoft.com/office/drawing/2017/model3d" xmlns:o="urn:schemas-microsoft-com:office:office" xmlns:oel="http://schemas.microsoft.com/office/2019/extlst" xmlns:r="http://schemas.openxmlformats.org/officeDocument/2006/relationships" xmlns:m="http://schemas.openxmlformats.org/officeDocument/2006/math" xmlns:v="urn:schemas-microsoft-com:vml" xmlns:wp14="http://schemas.microsoft.com/office/word/2010/wordprocessingDrawing" xmlns:wp="http://schemas.openxmlformats.org/drawingml/2006/wordprocessingDrawing" xmlns:w10="urn:schemas-microsoft-com:office:word" xmlns:w="http://schemas.openxmlformats.org/wordprocessingml/2006/main" xmlns:w14="http://schemas.microsoft.com/office/word/2010/wordml" xmlns:w15="http://schemas.microsoft.com/office/word/2012/wordml" xmlns:w16cex="http://schemas.microsoft.com/office/word/2018/wordml/cex" xmlns:w16cid="http://schemas.microsoft.com/office/word/2016/wordml/cid" xmlns:w16="http://schemas.microsoft.com/office/word/2018/wordml" xmlns:w16du="http://schemas.microsoft.com/office/word/2023/wordml/word16du" xmlns:w16sdtdh="http://schemas.microsoft.com/office/word/2020/wordml/sdtdatahash" xmlns:w16sdtfl="http://schemas.microsoft.com/office/word/2024/wordml/sdtformatlock" xmlns:w16se="http://schemas.microsoft.com/office/word/2015/wordml/symex" xmlns:wpg="http://schemas.microsoft.com/office/word/2010/wordprocessingGroup" xmlns:wpi="http://schemas.microsoft.com/office/word/2010/wordprocessingInk" xmlns:wne="http://schemas.microsoft.com/office/word/2006/wordml" xmlns:wps="http://schemas.microsoft.com/office/word/2010/wordprocessingShape" mc:Ignorable="w14 w15 w16se w16cid w16 w16cex w16sdtdh w16sdtfl w16du wp14">
   <w:body>
     <w:p>
       <w:pPr>
@@ -300,7 +300,7 @@
       </w:r>
       <w:r>
         <w:rPr>
-          <w:rStyle w:val="Textoennegrita"/>
+          <w:rStyle w:val="Fuerte"/>
           <w:rFonts w:eastAsiaTheme="majorEastAsia"/>
         </w:rPr>
         <w:t>etiquetas HTML5, atributos HTML, propiedades CSS3 y conceptos básicos de JavaScript</w:t>
@@ -1369,57 +1369,17 @@
                 <w:rFonts w:ascii="Times New Roman" w:eastAsia="Times New Roman" w:hAnsi="Times New Roman" w:cs="Times New Roman"/>
                 <w:sz w:val="24"/>
                 <w:szCs w:val="24"/>
-                <w:lang w:val="es-CO" w:eastAsia="es-CO"/>
-              </w:rPr>
-            </w:pPr>
-            <w:r>
-              <w:rPr>
-                <w:rFonts w:ascii="Courier New" w:eastAsia="Times New Roman" w:hAnsi="Courier New" w:cs="Courier New"/>
-                <w:sz w:val="20"/>
-                <w:szCs w:val="20"/>
-                <w:lang w:val="es-CO" w:eastAsia="es-CO"/>
-              </w:rPr>
-              <w:t>&lt;</w:t>
-            </w:r>
-            <w:proofErr w:type="spellStart"/>
-            <w:r>
-              <w:rPr>
-                <w:rFonts w:ascii="Courier New" w:eastAsia="Times New Roman" w:hAnsi="Courier New" w:cs="Courier New"/>
-                <w:sz w:val="20"/>
-                <w:szCs w:val="20"/>
-                <w:lang w:val="es-CO" w:eastAsia="es-CO"/>
-              </w:rPr>
-              <w:t>header</w:t>
-            </w:r>
-            <w:proofErr w:type="spellEnd"/>
-            <w:r>
-              <w:rPr>
-                <w:rFonts w:ascii="Courier New" w:eastAsia="Times New Roman" w:hAnsi="Courier New" w:cs="Courier New"/>
-                <w:sz w:val="20"/>
-                <w:szCs w:val="20"/>
-                <w:lang w:val="es-CO" w:eastAsia="es-CO"/>
-              </w:rPr>
-              <w:t>&gt;Mi sitio web&lt;/</w:t>
-            </w:r>
-            <w:proofErr w:type="spellStart"/>
-            <w:r>
-              <w:rPr>
-                <w:rFonts w:ascii="Courier New" w:eastAsia="Times New Roman" w:hAnsi="Courier New" w:cs="Courier New"/>
-                <w:sz w:val="20"/>
-                <w:szCs w:val="20"/>
-                <w:lang w:val="es-CO" w:eastAsia="es-CO"/>
-              </w:rPr>
-              <w:t>header</w:t>
-            </w:r>
-            <w:proofErr w:type="spellEnd"/>
-            <w:r>
-              <w:rPr>
-                <w:rFonts w:ascii="Courier New" w:eastAsia="Times New Roman" w:hAnsi="Courier New" w:cs="Courier New"/>
-                <w:sz w:val="20"/>
-                <w:szCs w:val="20"/>
-                <w:lang w:val="es-CO" w:eastAsia="es-CO"/>
-              </w:rPr>
-              <w:t>&gt;</w:t>
+                <w:lang w:val="en-US" w:eastAsia="es-CO"/>
+              </w:rPr>
+            </w:pPr>
+            <w:r>
+              <w:rPr>
+                <w:rFonts w:ascii="Courier New" w:eastAsia="Times New Roman" w:hAnsi="Courier New" w:cs="Courier New"/>
+                <w:sz w:val="20"/>
+                <w:szCs w:val="20"/>
+                <w:lang w:val="en-US" w:eastAsia="es-CO"/>
+              </w:rPr>
+              <w:t>&lt;header&gt;Mi sitio web&lt;/header&gt;</w:t>
             </w:r>
           </w:p>
         </w:tc>
@@ -2635,9 +2595,9 @@
         <w:tblLook w:val="04A0" w:firstRow="1" w:lastRow="0" w:firstColumn="1" w:lastColumn="0" w:noHBand="0" w:noVBand="1"/>
       </w:tblPr>
       <w:tblGrid>
-        <w:gridCol w:w="1883"/>
-        <w:gridCol w:w="3921"/>
-        <w:gridCol w:w="4266"/>
+        <w:gridCol w:w="2002"/>
+        <w:gridCol w:w="4206"/>
+        <w:gridCol w:w="4416"/>
       </w:tblGrid>
       <w:tr>
         <w:trPr>
@@ -2868,6 +2828,7 @@
                 <w:szCs w:val="20"/>
                 <w:lang w:val="es-CO" w:eastAsia="es-CO"/>
               </w:rPr>
+              <w:lastRenderedPageBreak/>
               <w:t>&lt;h2&gt;</w:t>
             </w:r>
           </w:p>
@@ -3928,7 +3889,6 @@
                 <w:szCs w:val="20"/>
                 <w:lang w:val="es-CO" w:eastAsia="es-CO"/>
               </w:rPr>
-              <w:lastRenderedPageBreak/>
               <w:t>&lt;b&gt;</w:t>
             </w:r>
           </w:p>
@@ -5221,15 +5181,15 @@
                 <w:rFonts w:ascii="Times New Roman" w:eastAsia="Times New Roman" w:hAnsi="Times New Roman" w:cs="Times New Roman"/>
                 <w:sz w:val="24"/>
                 <w:szCs w:val="24"/>
-                <w:lang w:val="es-CO" w:eastAsia="es-CO"/>
-              </w:rPr>
-            </w:pPr>
-            <w:r>
-              <w:rPr>
-                <w:rFonts w:ascii="Courier New" w:eastAsia="Times New Roman" w:hAnsi="Courier New" w:cs="Courier New"/>
-                <w:sz w:val="20"/>
-                <w:szCs w:val="20"/>
-                <w:lang w:val="es-CO" w:eastAsia="es-CO"/>
+                <w:lang w:val="en-US" w:eastAsia="es-CO"/>
+              </w:rPr>
+            </w:pPr>
+            <w:r>
+              <w:rPr>
+                <w:rFonts w:ascii="Courier New" w:eastAsia="Times New Roman" w:hAnsi="Courier New" w:cs="Courier New"/>
+                <w:sz w:val="20"/>
+                <w:szCs w:val="20"/>
+                <w:lang w:val="en-US" w:eastAsia="es-CO"/>
               </w:rPr>
               <w:t xml:space="preserve">&lt;a </w:t>
             </w:r>
@@ -5239,7 +5199,7 @@
                 <w:rFonts w:ascii="Courier New" w:eastAsia="Times New Roman" w:hAnsi="Courier New" w:cs="Courier New"/>
                 <w:sz w:val="20"/>
                 <w:szCs w:val="20"/>
-                <w:lang w:val="es-CO" w:eastAsia="es-CO"/>
+                <w:lang w:val="en-US" w:eastAsia="es-CO"/>
               </w:rPr>
               <w:t>href</w:t>
             </w:r>
@@ -5249,49 +5209,29 @@
                 <w:rFonts w:ascii="Courier New" w:eastAsia="Times New Roman" w:hAnsi="Courier New" w:cs="Courier New"/>
                 <w:sz w:val="20"/>
                 <w:szCs w:val="20"/>
-                <w:lang w:val="es-CO" w:eastAsia="es-CO"/>
-              </w:rPr>
-              <w:t xml:space="preserve">="pagina.html" </w:t>
-            </w:r>
-            <w:proofErr w:type="gramStart"/>
-            <w:r>
-              <w:rPr>
-                <w:rFonts w:ascii="Courier New" w:eastAsia="Times New Roman" w:hAnsi="Courier New" w:cs="Courier New"/>
-                <w:sz w:val="20"/>
-                <w:szCs w:val="20"/>
-                <w:lang w:val="es-CO" w:eastAsia="es-CO"/>
-              </w:rPr>
-              <w:t>target</w:t>
-            </w:r>
-            <w:proofErr w:type="gramEnd"/>
-            <w:r>
-              <w:rPr>
-                <w:rFonts w:ascii="Courier New" w:eastAsia="Times New Roman" w:hAnsi="Courier New" w:cs="Courier New"/>
-                <w:sz w:val="20"/>
-                <w:szCs w:val="20"/>
-                <w:lang w:val="es-CO" w:eastAsia="es-CO"/>
-              </w:rPr>
-              <w:t>="_</w:t>
-            </w:r>
-            <w:proofErr w:type="spellStart"/>
-            <w:r>
-              <w:rPr>
-                <w:rFonts w:ascii="Courier New" w:eastAsia="Times New Roman" w:hAnsi="Courier New" w:cs="Courier New"/>
-                <w:sz w:val="20"/>
-                <w:szCs w:val="20"/>
-                <w:lang w:val="es-CO" w:eastAsia="es-CO"/>
-              </w:rPr>
-              <w:t>blank</w:t>
-            </w:r>
-            <w:proofErr w:type="spellEnd"/>
-            <w:r>
-              <w:rPr>
-                <w:rFonts w:ascii="Courier New" w:eastAsia="Times New Roman" w:hAnsi="Courier New" w:cs="Courier New"/>
-                <w:sz w:val="20"/>
-                <w:szCs w:val="20"/>
-                <w:lang w:val="es-CO" w:eastAsia="es-CO"/>
-              </w:rPr>
-              <w:t>"&gt;Abrir&lt;/a&gt;</w:t>
+                <w:lang w:val="en-US" w:eastAsia="es-CO"/>
+              </w:rPr>
+              <w:t>="pagina.html" target="_blank"&gt;</w:t>
+            </w:r>
+            <w:proofErr w:type="spellStart"/>
+            <w:r>
+              <w:rPr>
+                <w:rFonts w:ascii="Courier New" w:eastAsia="Times New Roman" w:hAnsi="Courier New" w:cs="Courier New"/>
+                <w:sz w:val="20"/>
+                <w:szCs w:val="20"/>
+                <w:lang w:val="en-US" w:eastAsia="es-CO"/>
+              </w:rPr>
+              <w:t>Abrir</w:t>
+            </w:r>
+            <w:proofErr w:type="spellEnd"/>
+            <w:r>
+              <w:rPr>
+                <w:rFonts w:ascii="Courier New" w:eastAsia="Times New Roman" w:hAnsi="Courier New" w:cs="Courier New"/>
+                <w:sz w:val="20"/>
+                <w:szCs w:val="20"/>
+                <w:lang w:val="en-US" w:eastAsia="es-CO"/>
+              </w:rPr>
+              <w:t>&lt;/a&gt;</w:t>
             </w:r>
           </w:p>
         </w:tc>
@@ -5632,6 +5572,7 @@
                 <w:szCs w:val="20"/>
                 <w:lang w:val="es-CO" w:eastAsia="es-CO"/>
               </w:rPr>
+              <w:lastRenderedPageBreak/>
               <w:t>alt</w:t>
             </w:r>
             <w:proofErr w:type="spellEnd"/>
@@ -7486,7 +7427,6 @@
           <w:b/>
           <w:bCs/>
         </w:rPr>
-        <w:lastRenderedPageBreak/>
         <w:t>Formularios HTML5</w:t>
       </w:r>
     </w:p>
@@ -7510,9 +7450,9 @@
         <w:tblLook w:val="04A0" w:firstRow="1" w:lastRow="0" w:firstColumn="1" w:lastColumn="0" w:noHBand="0" w:noVBand="1"/>
       </w:tblPr>
       <w:tblGrid>
-        <w:gridCol w:w="1847"/>
-        <w:gridCol w:w="3885"/>
-        <w:gridCol w:w="4338"/>
+        <w:gridCol w:w="2002"/>
+        <w:gridCol w:w="4799"/>
+        <w:gridCol w:w="4656"/>
       </w:tblGrid>
       <w:tr>
         <w:trPr>
@@ -8202,6 +8142,7 @@
                 <w:szCs w:val="20"/>
                 <w:lang w:val="es-CO" w:eastAsia="es-CO"/>
               </w:rPr>
+              <w:lastRenderedPageBreak/>
               <w:t>name</w:t>
             </w:r>
             <w:proofErr w:type="spellEnd"/>
@@ -11269,6 +11210,7 @@
                 <w:szCs w:val="20"/>
                 <w:lang w:val="es-CO" w:eastAsia="es-CO"/>
               </w:rPr>
+              <w:lastRenderedPageBreak/>
               <w:t>&lt;</w:t>
             </w:r>
             <w:proofErr w:type="spellStart"/>
@@ -11538,7 +11480,6 @@
           <w:b/>
           <w:bCs/>
         </w:rPr>
-        <w:lastRenderedPageBreak/>
         <w:t>7. Multimedia</w:t>
       </w:r>
     </w:p>
@@ -11572,8 +11513,8 @@
       </w:tblPr>
       <w:tblGrid>
         <w:gridCol w:w="1416"/>
-        <w:gridCol w:w="4701"/>
-        <w:gridCol w:w="3953"/>
+        <w:gridCol w:w="5625"/>
+        <w:gridCol w:w="4056"/>
       </w:tblGrid>
       <w:tr>
         <w:trPr>
@@ -13735,6 +13676,7 @@
                 <w:szCs w:val="20"/>
                 <w:lang w:val="es-CO" w:eastAsia="es-CO"/>
               </w:rPr>
+              <w:lastRenderedPageBreak/>
               <w:t>background</w:t>
             </w:r>
             <w:proofErr w:type="spellEnd"/>
@@ -15513,8 +15455,8 @@
       </w:tblPr>
       <w:tblGrid>
         <w:gridCol w:w="2256"/>
-        <w:gridCol w:w="3773"/>
-        <w:gridCol w:w="4046"/>
+        <w:gridCol w:w="5265"/>
+        <w:gridCol w:w="5117"/>
       </w:tblGrid>
       <w:tr>
         <w:trPr>
@@ -16253,6 +16195,7 @@
                 <w:szCs w:val="20"/>
                 <w:lang w:val="es-CO" w:eastAsia="es-CO"/>
               </w:rPr>
+              <w:lastRenderedPageBreak/>
               <w:t>[</w:t>
             </w:r>
             <w:proofErr w:type="spellStart"/>
@@ -17237,7 +17180,7 @@
       </w:r>
       <w:r>
         <w:rPr>
-          <w:rStyle w:val="Textoennegrita"/>
+          <w:rStyle w:val="Fuerte"/>
         </w:rPr>
         <w:t>HTML5 y CSS3</w:t>
       </w:r>
@@ -17246,7 +17189,7 @@
       </w:r>
       <w:r>
         <w:rPr>
-          <w:rStyle w:val="Textoennegrita"/>
+          <w:rStyle w:val="Fuerte"/>
         </w:rPr>
         <w:t>ampliación didáctica</w:t>
       </w:r>
@@ -17469,15 +17412,15 @@
                 <w:rFonts w:ascii="Times New Roman" w:eastAsia="Times New Roman" w:hAnsi="Times New Roman" w:cs="Times New Roman"/>
                 <w:sz w:val="24"/>
                 <w:szCs w:val="24"/>
-                <w:lang w:val="es-CO" w:eastAsia="es-CO"/>
-              </w:rPr>
-            </w:pPr>
-            <w:r>
-              <w:rPr>
-                <w:rFonts w:ascii="Courier New" w:eastAsia="Times New Roman" w:hAnsi="Courier New" w:cs="Courier New"/>
-                <w:sz w:val="20"/>
-                <w:szCs w:val="20"/>
-                <w:lang w:val="es-CO" w:eastAsia="es-CO"/>
+                <w:lang w:val="en-US" w:eastAsia="es-CO"/>
+              </w:rPr>
+            </w:pPr>
+            <w:r>
+              <w:rPr>
+                <w:rFonts w:ascii="Courier New" w:eastAsia="Times New Roman" w:hAnsi="Courier New" w:cs="Courier New"/>
+                <w:sz w:val="20"/>
+                <w:szCs w:val="20"/>
+                <w:lang w:val="en-US" w:eastAsia="es-CO"/>
               </w:rPr>
               <w:t xml:space="preserve">&lt;script </w:t>
             </w:r>
@@ -17487,7 +17430,7 @@
                 <w:rFonts w:ascii="Courier New" w:eastAsia="Times New Roman" w:hAnsi="Courier New" w:cs="Courier New"/>
                 <w:sz w:val="20"/>
                 <w:szCs w:val="20"/>
-                <w:lang w:val="es-CO" w:eastAsia="es-CO"/>
+                <w:lang w:val="en-US" w:eastAsia="es-CO"/>
               </w:rPr>
               <w:t>src</w:t>
             </w:r>
@@ -17497,7 +17440,7 @@
                 <w:rFonts w:ascii="Courier New" w:eastAsia="Times New Roman" w:hAnsi="Courier New" w:cs="Courier New"/>
                 <w:sz w:val="20"/>
                 <w:szCs w:val="20"/>
-                <w:lang w:val="es-CO" w:eastAsia="es-CO"/>
+                <w:lang w:val="en-US" w:eastAsia="es-CO"/>
               </w:rPr>
               <w:t>="app.js"&gt;&lt;/script&gt;</w:t>
             </w:r>
@@ -17526,14 +17469,25 @@
                 <w:lang w:val="es-CO" w:eastAsia="es-CO"/>
               </w:rPr>
             </w:pPr>
-            <w:r>
-              <w:rPr>
-                <w:rFonts w:ascii="Courier New" w:eastAsia="Times New Roman" w:hAnsi="Courier New" w:cs="Courier New"/>
-                <w:sz w:val="20"/>
-                <w:szCs w:val="20"/>
-                <w:lang w:val="es-CO" w:eastAsia="es-CO"/>
-              </w:rPr>
-              <w:t>console.log()</w:t>
+            <w:proofErr w:type="gramStart"/>
+            <w:r>
+              <w:rPr>
+                <w:rFonts w:ascii="Courier New" w:eastAsia="Times New Roman" w:hAnsi="Courier New" w:cs="Courier New"/>
+                <w:sz w:val="20"/>
+                <w:szCs w:val="20"/>
+                <w:lang w:val="es-CO" w:eastAsia="es-CO"/>
+              </w:rPr>
+              <w:t>console.log(</w:t>
+            </w:r>
+            <w:proofErr w:type="gramEnd"/>
+            <w:r>
+              <w:rPr>
+                <w:rFonts w:ascii="Courier New" w:eastAsia="Times New Roman" w:hAnsi="Courier New" w:cs="Courier New"/>
+                <w:sz w:val="20"/>
+                <w:szCs w:val="20"/>
+                <w:lang w:val="es-CO" w:eastAsia="es-CO"/>
+              </w:rPr>
+              <w:t>)</w:t>
             </w:r>
           </w:p>
         </w:tc>
@@ -17968,7 +17922,6 @@
                 <w:szCs w:val="20"/>
                 <w:lang w:val="es-CO" w:eastAsia="es-CO"/>
               </w:rPr>
-              <w:lastRenderedPageBreak/>
               <w:t>addEventListener</w:t>
             </w:r>
             <w:proofErr w:type="spellEnd"/>
@@ -18031,6 +17984,7 @@
               </w:rPr>
             </w:pPr>
             <w:proofErr w:type="spellStart"/>
+            <w:proofErr w:type="gramStart"/>
             <w:r>
               <w:rPr>
                 <w:rFonts w:ascii="Courier New" w:eastAsia="Times New Roman" w:hAnsi="Courier New" w:cs="Courier New"/>
@@ -18041,6 +17995,7 @@
               <w:t>boton.addEventListener</w:t>
             </w:r>
             <w:proofErr w:type="spellEnd"/>
+            <w:proofErr w:type="gramEnd"/>
             <w:r>
               <w:rPr>
                 <w:rFonts w:ascii="Courier New" w:eastAsia="Times New Roman" w:hAnsi="Courier New" w:cs="Courier New"/>
@@ -18182,6 +18137,7 @@
       </w:tr>
       <w:tr>
         <w:trPr>
+          <w:trHeight w:val="50"/>
           <w:tblCellSpacing w:w="15" w:type="dxa"/>
         </w:trPr>
         <w:tc>
@@ -18588,9 +18544,9 @@
           <w:sz w:val="20"/>
         </w:rPr>
         <w:drawing>
-          <wp:inline distT="0" distB="0" distL="0" distR="0" wp14:anchorId="7967AD36" wp14:editId="196CE189">
-            <wp:extent cx="2004007" cy="1482185"/>
-            <wp:effectExtent l="0" t="0" r="0" b="0"/>
+          <wp:inline distT="0" distB="0" distL="0" distR="0" wp14:anchorId="7967AD36" wp14:editId="4C49EA62">
+            <wp:extent cx="3648075" cy="2390775"/>
+            <wp:effectExtent l="0" t="0" r="0" b="9525"/>
             <wp:docPr id="47" name="Image 47"/>
             <wp:cNvGraphicFramePr>
               <a:graphicFrameLocks xmlns:a="http://schemas.openxmlformats.org/drawingml/2006/main"/>
@@ -18611,7 +18567,7 @@
                   <pic:spPr>
                     <a:xfrm>
                       <a:off x="0" y="0"/>
-                      <a:ext cx="2004007" cy="1482185"/>
+                      <a:ext cx="3649138" cy="2391472"/>
                     </a:xfrm>
                     <a:prstGeom prst="rect">
                       <a:avLst/>
@@ -18636,9 +18592,9 @@
           <w:sz w:val="20"/>
         </w:rPr>
         <w:drawing>
-          <wp:inline distT="0" distB="0" distL="0" distR="0" wp14:anchorId="0115146C" wp14:editId="20BD29EF">
-            <wp:extent cx="2910196" cy="1410176"/>
-            <wp:effectExtent l="0" t="0" r="0" b="0"/>
+          <wp:inline distT="0" distB="0" distL="0" distR="0" wp14:anchorId="0115146C" wp14:editId="2B013354">
+            <wp:extent cx="3952875" cy="2381250"/>
+            <wp:effectExtent l="0" t="0" r="9525" b="0"/>
             <wp:docPr id="48" name="Image 48"/>
             <wp:cNvGraphicFramePr>
               <a:graphicFrameLocks xmlns:a="http://schemas.openxmlformats.org/drawingml/2006/main"/>
@@ -18659,7 +18615,7 @@
                   <pic:spPr>
                     <a:xfrm>
                       <a:off x="0" y="0"/>
-                      <a:ext cx="2910196" cy="1410176"/>
+                      <a:ext cx="3954215" cy="2382057"/>
                     </a:xfrm>
                     <a:prstGeom prst="rect">
                       <a:avLst/>
@@ -19169,13 +19125,14 @@
         <w:rPr>
           <w:sz w:val="24"/>
         </w:rPr>
-        <w:t xml:space="preserve"> elegimos, el navegador opta por mostrar la siguiente que debería ser una similar, si tampoco la tiene instalada, mostrará la tipografía </w:t>
+        <w:t xml:space="preserve"> elegimos, el navegador opta por mostrar la </w:t>
       </w:r>
       <w:r>
         <w:rPr>
           <w:sz w:val="24"/>
         </w:rPr>
-        <w:t>por defecto.</w:t>
+        <w:lastRenderedPageBreak/>
+        <w:t>siguiente que debería ser una similar, si tampoco la tiene instalada, mostrará la tipografía por defecto.</w:t>
       </w:r>
     </w:p>
     <w:p>
@@ -19523,14 +19480,21 @@
         <w:rPr>
           <w:sz w:val="24"/>
         </w:rPr>
-        <w:t xml:space="preserve">dos son valores relativos, el pixel es un valor relativo a la resolución de la pantalla, </w:t>
-      </w:r>
+        <w:t xml:space="preserve">dos son valores relativos, el </w:t>
+      </w:r>
+      <w:proofErr w:type="gramStart"/>
       <w:r>
         <w:rPr>
           <w:sz w:val="24"/>
         </w:rPr>
-        <w:lastRenderedPageBreak/>
-        <w:t xml:space="preserve">pero </w:t>
+        <w:t>pixel</w:t>
+      </w:r>
+      <w:proofErr w:type="gramEnd"/>
+      <w:r>
+        <w:rPr>
+          <w:sz w:val="24"/>
+        </w:rPr>
+        <w:t xml:space="preserve"> es un valor relativo a la resolución de la pantalla, pero </w:t>
       </w:r>
       <w:proofErr w:type="gramStart"/>
       <w:r>
@@ -19544,13 +19508,7 @@
         <w:rPr>
           <w:sz w:val="24"/>
         </w:rPr>
-        <w:t xml:space="preserve"> es relativo al tamaño de la fuente definida por el usuario. Si el usuario no cambió la configuración, el valor por defecto de los textos en todos los navega</w:t>
-      </w:r>
-      <w:r>
-        <w:rPr>
-          <w:sz w:val="24"/>
-        </w:rPr>
-        <w:t>dores es de 16px. Entonces 1em = 16px.</w:t>
+        <w:t xml:space="preserve"> es relativo al tamaño de la fuente definida por el usuario. Si el usuario no cambió la configuración, el valor por defecto de los textos en todos los navegadores es de 16px. Entonces 1em = 16px.</w:t>
       </w:r>
     </w:p>
     <w:p>
@@ -19641,13 +19599,7 @@
         <w:rPr>
           <w:sz w:val="24"/>
         </w:rPr>
-        <w:t>,</w:t>
-      </w:r>
-      <w:r>
-        <w:rPr>
-          <w:sz w:val="24"/>
-        </w:rPr>
-        <w:t xml:space="preserve"> red, </w:t>
+        <w:t xml:space="preserve">, red, </w:t>
       </w:r>
       <w:proofErr w:type="spellStart"/>
       <w:r>
@@ -19916,13 +19868,7 @@
         <w:rPr>
           <w:sz w:val="24"/>
         </w:rPr>
-        <w:t>Definen el ancho máximo o mínimo de un e</w:t>
-      </w:r>
-      <w:r>
-        <w:rPr>
-          <w:sz w:val="24"/>
-        </w:rPr>
-        <w:t>lemento. Muy importante en sitios adaptables</w:t>
+        <w:t>Definen el ancho máximo o mínimo de un elemento. Muy importante en sitios adaptables</w:t>
       </w:r>
     </w:p>
     <w:p>
@@ -19947,23 +19893,13 @@
           <w:sz w:val="24"/>
         </w:rPr>
       </w:pPr>
-      <w:proofErr w:type="spellStart"/>
       <w:r>
         <w:rPr>
           <w:rFonts w:ascii="Arial" w:hAnsi="Arial"/>
           <w:b/>
           <w:sz w:val="24"/>
         </w:rPr>
-        <w:t>Height</w:t>
-      </w:r>
-      <w:proofErr w:type="spellEnd"/>
-      <w:r>
-        <w:rPr>
-          <w:rFonts w:ascii="Arial" w:hAnsi="Arial"/>
-          <w:b/>
-          <w:sz w:val="24"/>
-        </w:rPr>
-        <w:t xml:space="preserve">: </w:t>
+        <w:t xml:space="preserve">Height: </w:t>
       </w:r>
       <w:r>
         <w:rPr>
@@ -20033,834 +19969,295 @@
         <w:rPr>
           <w:sz w:val="24"/>
         </w:rPr>
-        <w:sectPr>
-          <w:pgSz w:w="12240" w:h="15840"/>
-          <w:pgMar w:top="1340" w:right="1080" w:bottom="280" w:left="1080" w:header="720" w:footer="720" w:gutter="0"/>
-          <w:cols w:space="720"/>
-        </w:sectPr>
       </w:pPr>
     </w:p>
     <w:p>
       <w:pPr>
         <w:pStyle w:val="Prrafodelista"/>
-        <w:numPr>
-          <w:ilvl w:val="0"/>
-          <w:numId w:val="1"/>
-        </w:numPr>
-        <w:tabs>
-          <w:tab w:val="left" w:pos="1342"/>
-        </w:tabs>
-        <w:spacing w:before="74" w:line="278" w:lineRule="auto"/>
-        <w:ind w:right="625"/>
+        <w:spacing w:line="276" w:lineRule="auto"/>
         <w:rPr>
           <w:sz w:val="24"/>
         </w:rPr>
-      </w:pPr>
-      <w:r>
-        <w:rPr>
-          <w:rFonts w:ascii="Arial" w:hAnsi="Arial"/>
-          <w:b/>
-          <w:sz w:val="24"/>
-        </w:rPr>
-        <w:lastRenderedPageBreak/>
-        <w:t>Max-</w:t>
-      </w:r>
-      <w:proofErr w:type="spellStart"/>
-      <w:r>
-        <w:rPr>
-          <w:rFonts w:ascii="Arial" w:hAnsi="Arial"/>
-          <w:b/>
-          <w:sz w:val="24"/>
-        </w:rPr>
-        <w:t>height</w:t>
-      </w:r>
-      <w:proofErr w:type="spellEnd"/>
-      <w:r>
-        <w:rPr>
-          <w:rFonts w:ascii="Arial" w:hAnsi="Arial"/>
-          <w:b/>
-          <w:sz w:val="24"/>
-        </w:rPr>
-        <w:t xml:space="preserve"> o min-</w:t>
-      </w:r>
-      <w:proofErr w:type="spellStart"/>
-      <w:r>
-        <w:rPr>
-          <w:rFonts w:ascii="Arial" w:hAnsi="Arial"/>
-          <w:b/>
-          <w:sz w:val="24"/>
-        </w:rPr>
-        <w:t>height</w:t>
-      </w:r>
-      <w:proofErr w:type="spellEnd"/>
-      <w:r>
-        <w:rPr>
-          <w:rFonts w:ascii="Arial" w:hAnsi="Arial"/>
-          <w:b/>
-          <w:sz w:val="24"/>
-        </w:rPr>
-        <w:t xml:space="preserve">: </w:t>
-      </w:r>
-      <w:r>
-        <w:rPr>
-          <w:sz w:val="24"/>
-        </w:rPr>
-        <w:t>Definen el alto máximo o mínimo de un elemento. Muy importante en sitios adaptab</w:t>
-      </w:r>
-      <w:r>
-        <w:rPr>
-          <w:sz w:val="24"/>
-        </w:rPr>
-        <w:t>les</w:t>
-      </w:r>
-    </w:p>
-    <w:p>
-      <w:pPr>
-        <w:pStyle w:val="Textoindependiente"/>
-        <w:spacing w:before="37"/>
       </w:pPr>
     </w:p>
     <w:p>
       <w:pPr>
         <w:pStyle w:val="Prrafodelista"/>
-        <w:numPr>
-          <w:ilvl w:val="0"/>
-          <w:numId w:val="1"/>
-        </w:numPr>
+        <w:spacing w:line="276" w:lineRule="auto"/>
+        <w:jc w:val="left"/>
+        <w:rPr>
+          <w:sz w:val="24"/>
+        </w:rPr>
+      </w:pPr>
+    </w:p>
+    <w:p>
+      <w:pPr>
+        <w:rPr>
+          <w:sz w:val="24"/>
+        </w:rPr>
+      </w:pPr>
+      <w:r>
+        <w:rPr>
+          <w:sz w:val="24"/>
+        </w:rPr>
+        <w:br w:type="page"/>
+      </w:r>
+    </w:p>
+    <w:p>
+      <w:pPr>
+        <w:pStyle w:val="Prrafodelista"/>
+        <w:spacing w:line="276" w:lineRule="auto"/>
+        <w:jc w:val="left"/>
+        <w:rPr>
+          <w:b/>
+          <w:bCs/>
+          <w:sz w:val="24"/>
+        </w:rPr>
+      </w:pPr>
+      <w:r>
+        <w:rPr>
+          <w:b/>
+          <w:bCs/>
+          <w:sz w:val="24"/>
+        </w:rPr>
+        <w:lastRenderedPageBreak/>
+        <w:t xml:space="preserve">Ejercicio 1: </w:t>
+      </w:r>
+    </w:p>
+    <w:p>
+      <w:pPr>
+        <w:pStyle w:val="Prrafodelista"/>
+        <w:spacing w:line="276" w:lineRule="auto"/>
+        <w:jc w:val="left"/>
+        <w:rPr>
+          <w:sz w:val="24"/>
+        </w:rPr>
+        <w:sectPr>
+          <w:pgSz w:w="15840" w:h="12240" w:orient="landscape"/>
+          <w:pgMar w:top="1080" w:right="1340" w:bottom="1080" w:left="280" w:header="720" w:footer="720" w:gutter="0"/>
+          <w:cols w:space="720"/>
+          <w:docGrid w:linePitch="299"/>
+        </w:sectPr>
+      </w:pPr>
+      <w:r>
+        <w:rPr>
+          <w:sz w:val="24"/>
+        </w:rPr>
+        <w:drawing>
+          <wp:inline distT="0" distB="0" distL="0" distR="0" wp14:anchorId="0FB6EBB2" wp14:editId="505E8DC2">
+            <wp:extent cx="9029700" cy="5076825"/>
+            <wp:effectExtent l="0" t="0" r="0" b="9525"/>
+            <wp:docPr id="1126106617" name="Imagen 1"/>
+            <wp:cNvGraphicFramePr>
+              <a:graphicFrameLocks xmlns:a="http://schemas.openxmlformats.org/drawingml/2006/main" noChangeAspect="1"/>
+            </wp:cNvGraphicFramePr>
+            <a:graphic xmlns:a="http://schemas.openxmlformats.org/drawingml/2006/main">
+              <a:graphicData uri="http://schemas.openxmlformats.org/drawingml/2006/picture">
+                <pic:pic xmlns:pic="http://schemas.openxmlformats.org/drawingml/2006/picture">
+                  <pic:nvPicPr>
+                    <pic:cNvPr id="1126106617" name=""/>
+                    <pic:cNvPicPr/>
+                  </pic:nvPicPr>
+                  <pic:blipFill>
+                    <a:blip r:embed="rId10"/>
+                    <a:stretch>
+                      <a:fillRect/>
+                    </a:stretch>
+                  </pic:blipFill>
+                  <pic:spPr>
+                    <a:xfrm>
+                      <a:off x="0" y="0"/>
+                      <a:ext cx="9029700" cy="5076825"/>
+                    </a:xfrm>
+                    <a:prstGeom prst="rect">
+                      <a:avLst/>
+                    </a:prstGeom>
+                  </pic:spPr>
+                </pic:pic>
+              </a:graphicData>
+            </a:graphic>
+          </wp:inline>
+        </w:drawing>
+      </w:r>
+      <w:r>
+        <w:rPr>
+          <w:sz w:val="24"/>
+        </w:rPr>
+        <w:br/>
+      </w:r>
+    </w:p>
+    <w:p>
+      <w:pPr>
+        <w:pStyle w:val="Prrafodelista"/>
         <w:tabs>
           <w:tab w:val="left" w:pos="1342"/>
         </w:tabs>
         <w:spacing w:line="276" w:lineRule="auto"/>
-        <w:ind w:right="624"/>
-        <w:rPr>
-          <w:sz w:val="24"/>
-        </w:rPr>
-      </w:pPr>
-      <w:proofErr w:type="spellStart"/>
-      <w:r>
+        <w:ind w:right="621" w:firstLine="0"/>
         <w:rPr>
           <w:rFonts w:ascii="Arial" w:hAnsi="Arial"/>
           <w:b/>
           <w:sz w:val="24"/>
         </w:rPr>
-        <w:t>Padding</w:t>
-      </w:r>
-      <w:proofErr w:type="spellEnd"/>
+      </w:pPr>
+      <w:proofErr w:type="gramStart"/>
       <w:r>
         <w:rPr>
           <w:rFonts w:ascii="Arial" w:hAnsi="Arial"/>
           <w:b/>
           <w:sz w:val="24"/>
         </w:rPr>
-        <w:t xml:space="preserve">: </w:t>
-      </w:r>
-      <w:r>
-        <w:rPr>
+        <w:lastRenderedPageBreak/>
+        <w:t>HTML :</w:t>
+      </w:r>
+      <w:proofErr w:type="gramEnd"/>
+      <w:r>
+        <w:rPr>
+          <w:rFonts w:ascii="Arial" w:hAnsi="Arial"/>
+          <w:b/>
           <w:sz w:val="24"/>
         </w:rPr>
-        <w:t>Es la distancia desde el borde de un elemento hasta su</w:t>
-      </w:r>
-      <w:r>
-        <w:rPr>
-          <w:spacing w:val="40"/>
+        <w:t xml:space="preserve"> </w:t>
+      </w:r>
+      <w:r>
+        <w:rPr>
+          <w:rFonts w:ascii="Arial" w:hAnsi="Arial"/>
+          <w:b/>
           <w:sz w:val="24"/>
         </w:rPr>
-        <w:t xml:space="preserve"> </w:t>
-      </w:r>
-      <w:r>
-        <w:rPr>
-          <w:spacing w:val="-2"/>
-          <w:sz w:val="24"/>
-        </w:rPr>
-        <w:t>contenido.</w:t>
-      </w:r>
-    </w:p>
-    <w:p>
-      <w:pPr>
-        <w:pStyle w:val="Textoindependiente"/>
-        <w:spacing w:before="42"/>
-      </w:pPr>
+        <w:drawing>
+          <wp:inline distT="0" distB="0" distL="0" distR="0" wp14:anchorId="0A6F6F3F" wp14:editId="700B897E">
+            <wp:extent cx="5353797" cy="5801535"/>
+            <wp:effectExtent l="0" t="0" r="0" b="8890"/>
+            <wp:docPr id="1623745783" name="Imagen 1"/>
+            <wp:cNvGraphicFramePr>
+              <a:graphicFrameLocks xmlns:a="http://schemas.openxmlformats.org/drawingml/2006/main" noChangeAspect="1"/>
+            </wp:cNvGraphicFramePr>
+            <a:graphic xmlns:a="http://schemas.openxmlformats.org/drawingml/2006/main">
+              <a:graphicData uri="http://schemas.openxmlformats.org/drawingml/2006/picture">
+                <pic:pic xmlns:pic="http://schemas.openxmlformats.org/drawingml/2006/picture">
+                  <pic:nvPicPr>
+                    <pic:cNvPr id="1623745783" name=""/>
+                    <pic:cNvPicPr/>
+                  </pic:nvPicPr>
+                  <pic:blipFill>
+                    <a:blip r:embed="rId11"/>
+                    <a:stretch>
+                      <a:fillRect/>
+                    </a:stretch>
+                  </pic:blipFill>
+                  <pic:spPr>
+                    <a:xfrm>
+                      <a:off x="0" y="0"/>
+                      <a:ext cx="5353797" cy="5801535"/>
+                    </a:xfrm>
+                    <a:prstGeom prst="rect">
+                      <a:avLst/>
+                    </a:prstGeom>
+                  </pic:spPr>
+                </pic:pic>
+              </a:graphicData>
+            </a:graphic>
+          </wp:inline>
+        </w:drawing>
+      </w:r>
     </w:p>
     <w:p>
       <w:pPr>
         <w:pStyle w:val="Prrafodelista"/>
-        <w:numPr>
-          <w:ilvl w:val="0"/>
-          <w:numId w:val="1"/>
-        </w:numPr>
         <w:tabs>
           <w:tab w:val="left" w:pos="1342"/>
         </w:tabs>
         <w:spacing w:line="276" w:lineRule="auto"/>
-        <w:ind w:right="627"/>
-        <w:rPr>
-          <w:sz w:val="24"/>
+        <w:ind w:right="621" w:firstLine="0"/>
+        <w:rPr>
+          <w:noProof/>
         </w:rPr>
       </w:pPr>
-      <w:proofErr w:type="spellStart"/>
       <w:r>
         <w:rPr>
           <w:rFonts w:ascii="Arial" w:hAnsi="Arial"/>
           <w:b/>
           <w:sz w:val="24"/>
         </w:rPr>
-        <w:t>Margin</w:t>
-      </w:r>
-      <w:proofErr w:type="spellEnd"/>
+        <w:lastRenderedPageBreak/>
+        <w:t>CSS:</w:t>
+      </w:r>
+      <w:r>
+        <w:rPr>
+          <w:noProof/>
+        </w:rPr>
+        <w:t xml:space="preserve"> </w:t>
+      </w:r>
       <w:r>
         <w:rPr>
           <w:rFonts w:ascii="Arial" w:hAnsi="Arial"/>
           <w:b/>
           <w:sz w:val="24"/>
         </w:rPr>
-        <w:t xml:space="preserve">: </w:t>
-      </w:r>
-      <w:r>
-        <w:rPr>
-          <w:sz w:val="24"/>
-        </w:rPr>
-        <w:t>Es la distancia entre un elemento y otro (desde el borde de un elemento hacia afuera)</w:t>
-      </w:r>
-    </w:p>
-    <w:p>
-      <w:pPr>
-        <w:pStyle w:val="Textoindependiente"/>
-        <w:spacing w:before="42"/>
-      </w:pPr>
+        <w:drawing>
+          <wp:inline distT="0" distB="0" distL="0" distR="0" wp14:anchorId="652A26CC" wp14:editId="1D1F45F0">
+            <wp:extent cx="3232785" cy="6400800"/>
+            <wp:effectExtent l="0" t="0" r="5715" b="0"/>
+            <wp:docPr id="1879739389" name="Imagen 1"/>
+            <wp:cNvGraphicFramePr>
+              <a:graphicFrameLocks xmlns:a="http://schemas.openxmlformats.org/drawingml/2006/main" noChangeAspect="1"/>
+            </wp:cNvGraphicFramePr>
+            <a:graphic xmlns:a="http://schemas.openxmlformats.org/drawingml/2006/main">
+              <a:graphicData uri="http://schemas.openxmlformats.org/drawingml/2006/picture">
+                <pic:pic xmlns:pic="http://schemas.openxmlformats.org/drawingml/2006/picture">
+                  <pic:nvPicPr>
+                    <pic:cNvPr id="1879739389" name=""/>
+                    <pic:cNvPicPr/>
+                  </pic:nvPicPr>
+                  <pic:blipFill>
+                    <a:blip r:embed="rId12"/>
+                    <a:stretch>
+                      <a:fillRect/>
+                    </a:stretch>
+                  </pic:blipFill>
+                  <pic:spPr>
+                    <a:xfrm>
+                      <a:off x="0" y="0"/>
+                      <a:ext cx="3232785" cy="6400800"/>
+                    </a:xfrm>
+                    <a:prstGeom prst="rect">
+                      <a:avLst/>
+                    </a:prstGeom>
+                  </pic:spPr>
+                </pic:pic>
+              </a:graphicData>
+            </a:graphic>
+          </wp:inline>
+        </w:drawing>
+      </w:r>
     </w:p>
     <w:p>
       <w:pPr>
         <w:pStyle w:val="Prrafodelista"/>
-        <w:numPr>
-          <w:ilvl w:val="0"/>
-          <w:numId w:val="1"/>
-        </w:numPr>
-        <w:tabs>
-          <w:tab w:val="left" w:pos="1340"/>
-        </w:tabs>
-        <w:ind w:left="1340" w:hanging="359"/>
-        <w:jc w:val="left"/>
-        <w:rPr>
-          <w:sz w:val="24"/>
-        </w:rPr>
-      </w:pPr>
-      <w:proofErr w:type="spellStart"/>
-      <w:r>
-        <w:rPr>
-          <w:rFonts w:ascii="Arial" w:hAnsi="Arial"/>
-          <w:b/>
-          <w:sz w:val="24"/>
-        </w:rPr>
-        <w:t>Border</w:t>
-      </w:r>
-      <w:proofErr w:type="spellEnd"/>
-      <w:r>
-        <w:rPr>
-          <w:rFonts w:ascii="Arial" w:hAnsi="Arial"/>
-          <w:b/>
-          <w:sz w:val="24"/>
-        </w:rPr>
-        <w:t xml:space="preserve">: </w:t>
-      </w:r>
-      <w:r>
-        <w:rPr>
-          <w:sz w:val="24"/>
-        </w:rPr>
-        <w:t>Define</w:t>
-      </w:r>
-      <w:r>
-        <w:rPr>
-          <w:spacing w:val="-4"/>
-          <w:sz w:val="24"/>
-        </w:rPr>
-        <w:t xml:space="preserve"> </w:t>
-      </w:r>
-      <w:r>
-        <w:rPr>
-          <w:sz w:val="24"/>
-        </w:rPr>
-        <w:t>el</w:t>
-      </w:r>
-      <w:r>
-        <w:rPr>
-          <w:spacing w:val="-2"/>
-          <w:sz w:val="24"/>
-        </w:rPr>
-        <w:t xml:space="preserve"> </w:t>
-      </w:r>
-      <w:r>
-        <w:rPr>
-          <w:sz w:val="24"/>
-        </w:rPr>
-        <w:t>borde</w:t>
-      </w:r>
-      <w:r>
-        <w:rPr>
-          <w:spacing w:val="-1"/>
-          <w:sz w:val="24"/>
-        </w:rPr>
-        <w:t xml:space="preserve"> </w:t>
-      </w:r>
-      <w:r>
-        <w:rPr>
-          <w:sz w:val="24"/>
-        </w:rPr>
-        <w:t>de</w:t>
-      </w:r>
-      <w:r>
-        <w:rPr>
-          <w:spacing w:val="-4"/>
-          <w:sz w:val="24"/>
-        </w:rPr>
-        <w:t xml:space="preserve"> </w:t>
-      </w:r>
-      <w:r>
-        <w:rPr>
-          <w:sz w:val="24"/>
-        </w:rPr>
-        <w:t>un</w:t>
-      </w:r>
-      <w:r>
-        <w:rPr>
-          <w:spacing w:val="-3"/>
-          <w:sz w:val="24"/>
-        </w:rPr>
-        <w:t xml:space="preserve"> </w:t>
-      </w:r>
-      <w:r>
-        <w:rPr>
-          <w:sz w:val="24"/>
-        </w:rPr>
-        <w:t>elemento,</w:t>
-      </w:r>
-      <w:r>
-        <w:rPr>
-          <w:spacing w:val="-4"/>
-          <w:sz w:val="24"/>
-        </w:rPr>
-        <w:t xml:space="preserve"> </w:t>
-      </w:r>
-      <w:r>
-        <w:rPr>
-          <w:sz w:val="24"/>
-        </w:rPr>
-        <w:t>su</w:t>
-      </w:r>
-      <w:r>
-        <w:rPr>
-          <w:spacing w:val="-1"/>
-          <w:sz w:val="24"/>
-        </w:rPr>
-        <w:t xml:space="preserve"> </w:t>
-      </w:r>
-      <w:r>
-        <w:rPr>
-          <w:sz w:val="24"/>
-        </w:rPr>
-        <w:t>color,</w:t>
-      </w:r>
-      <w:r>
-        <w:rPr>
-          <w:spacing w:val="-1"/>
-          <w:sz w:val="24"/>
-        </w:rPr>
-        <w:t xml:space="preserve"> </w:t>
-      </w:r>
-      <w:r>
-        <w:rPr>
-          <w:sz w:val="24"/>
-        </w:rPr>
-        <w:t>su</w:t>
-      </w:r>
-      <w:r>
-        <w:rPr>
-          <w:spacing w:val="-4"/>
-          <w:sz w:val="24"/>
-        </w:rPr>
-        <w:t xml:space="preserve"> </w:t>
-      </w:r>
-      <w:r>
-        <w:rPr>
-          <w:sz w:val="24"/>
-        </w:rPr>
-        <w:t>estilo</w:t>
-      </w:r>
-      <w:r>
-        <w:rPr>
-          <w:spacing w:val="4"/>
-          <w:sz w:val="24"/>
-        </w:rPr>
-        <w:t xml:space="preserve"> </w:t>
-      </w:r>
-      <w:r>
-        <w:rPr>
-          <w:sz w:val="24"/>
-        </w:rPr>
-        <w:t>y</w:t>
-      </w:r>
-      <w:r>
-        <w:rPr>
-          <w:spacing w:val="-5"/>
-          <w:sz w:val="24"/>
-        </w:rPr>
-        <w:t xml:space="preserve"> </w:t>
-      </w:r>
-      <w:r>
-        <w:rPr>
-          <w:spacing w:val="-2"/>
-          <w:sz w:val="24"/>
-        </w:rPr>
-        <w:t>grosor.</w:t>
-      </w:r>
-    </w:p>
-    <w:p>
-      <w:pPr>
-        <w:pStyle w:val="Textoindependiente"/>
-        <w:spacing w:before="82"/>
-      </w:pPr>
-    </w:p>
-    <w:p>
-      <w:pPr>
-        <w:pStyle w:val="Prrafodelista"/>
-        <w:numPr>
-          <w:ilvl w:val="0"/>
-          <w:numId w:val="1"/>
-        </w:numPr>
         <w:tabs>
           <w:tab w:val="left" w:pos="1342"/>
         </w:tabs>
         <w:spacing w:line="276" w:lineRule="auto"/>
-        <w:ind w:right="621"/>
+        <w:ind w:right="621" w:firstLine="0"/>
         <w:rPr>
           <w:sz w:val="24"/>
+          <w:u w:val="single"/>
         </w:rPr>
       </w:pPr>
-      <w:proofErr w:type="spellStart"/>
-      <w:r>
-        <w:rPr>
-          <w:rFonts w:ascii="Arial" w:hAnsi="Arial"/>
-          <w:b/>
-          <w:sz w:val="24"/>
-        </w:rPr>
-        <w:t>Background</w:t>
-      </w:r>
-      <w:proofErr w:type="spellEnd"/>
-      <w:r>
-        <w:rPr>
-          <w:rFonts w:ascii="Arial" w:hAnsi="Arial"/>
-          <w:b/>
-          <w:sz w:val="24"/>
-        </w:rPr>
-        <w:t xml:space="preserve">: </w:t>
-      </w:r>
-      <w:r>
-        <w:rPr>
-          <w:sz w:val="24"/>
-        </w:rPr>
-        <w:t>Define</w:t>
-      </w:r>
-      <w:r>
-        <w:rPr>
-          <w:spacing w:val="80"/>
-          <w:sz w:val="24"/>
-        </w:rPr>
-        <w:t xml:space="preserve"> </w:t>
-      </w:r>
-      <w:r>
-        <w:rPr>
-          <w:sz w:val="24"/>
-        </w:rPr>
-        <w:t>los</w:t>
-      </w:r>
-      <w:r>
-        <w:rPr>
-          <w:spacing w:val="80"/>
-          <w:sz w:val="24"/>
-        </w:rPr>
-        <w:t xml:space="preserve"> </w:t>
-      </w:r>
-      <w:r>
-        <w:rPr>
-          <w:sz w:val="24"/>
-        </w:rPr>
-        <w:t>fondos</w:t>
-      </w:r>
-      <w:r>
-        <w:rPr>
-          <w:spacing w:val="80"/>
-          <w:sz w:val="24"/>
-        </w:rPr>
-        <w:t xml:space="preserve"> </w:t>
-      </w:r>
-      <w:r>
-        <w:rPr>
-          <w:sz w:val="24"/>
-        </w:rPr>
-        <w:t>de</w:t>
-      </w:r>
-      <w:r>
-        <w:rPr>
-          <w:spacing w:val="80"/>
-          <w:sz w:val="24"/>
-        </w:rPr>
-        <w:t xml:space="preserve"> </w:t>
-      </w:r>
-      <w:r>
-        <w:rPr>
-          <w:sz w:val="24"/>
-        </w:rPr>
-        <w:t>un</w:t>
-      </w:r>
-      <w:r>
-        <w:rPr>
-          <w:spacing w:val="80"/>
-          <w:sz w:val="24"/>
-        </w:rPr>
-        <w:t xml:space="preserve"> </w:t>
-      </w:r>
-      <w:r>
-        <w:rPr>
-          <w:sz w:val="24"/>
-        </w:rPr>
-        <w:t>objeto.</w:t>
-      </w:r>
-      <w:r>
-        <w:rPr>
-          <w:spacing w:val="80"/>
-          <w:sz w:val="24"/>
-        </w:rPr>
-        <w:t xml:space="preserve"> </w:t>
-      </w:r>
-      <w:r>
-        <w:rPr>
-          <w:sz w:val="24"/>
-        </w:rPr>
-        <w:t>El</w:t>
-      </w:r>
-      <w:r>
-        <w:rPr>
-          <w:spacing w:val="80"/>
-          <w:sz w:val="24"/>
-        </w:rPr>
-        <w:t xml:space="preserve"> </w:t>
-      </w:r>
-      <w:r>
-        <w:rPr>
-          <w:sz w:val="24"/>
-        </w:rPr>
-        <w:t>fondo</w:t>
-      </w:r>
-      <w:r>
-        <w:rPr>
-          <w:spacing w:val="80"/>
-          <w:sz w:val="24"/>
-        </w:rPr>
-        <w:t xml:space="preserve"> </w:t>
-      </w:r>
-      <w:r>
-        <w:rPr>
-          <w:sz w:val="24"/>
-        </w:rPr>
-        <w:t>puede</w:t>
-      </w:r>
-      <w:r>
-        <w:rPr>
-          <w:spacing w:val="80"/>
-          <w:sz w:val="24"/>
-        </w:rPr>
-        <w:t xml:space="preserve"> </w:t>
-      </w:r>
-      <w:r>
-        <w:rPr>
-          <w:sz w:val="24"/>
-        </w:rPr>
-        <w:t>ser</w:t>
-      </w:r>
-      <w:r>
-        <w:rPr>
-          <w:spacing w:val="40"/>
-          <w:sz w:val="24"/>
-        </w:rPr>
-        <w:t xml:space="preserve"> </w:t>
-      </w:r>
-      <w:r>
-        <w:rPr>
-          <w:sz w:val="24"/>
-        </w:rPr>
-        <w:t>una</w:t>
-      </w:r>
-      <w:r>
-        <w:rPr>
-          <w:spacing w:val="-2"/>
-          <w:sz w:val="24"/>
-        </w:rPr>
-        <w:t xml:space="preserve"> </w:t>
-      </w:r>
-      <w:r>
-        <w:rPr>
-          <w:sz w:val="24"/>
-        </w:rPr>
-        <w:t>imagen</w:t>
-      </w:r>
-      <w:r>
-        <w:rPr>
-          <w:spacing w:val="-4"/>
-          <w:sz w:val="24"/>
-        </w:rPr>
-        <w:t xml:space="preserve"> </w:t>
-      </w:r>
-      <w:r>
-        <w:rPr>
-          <w:sz w:val="24"/>
-        </w:rPr>
-        <w:t>o un</w:t>
-      </w:r>
-      <w:r>
-        <w:rPr>
-          <w:spacing w:val="-1"/>
-          <w:sz w:val="24"/>
-        </w:rPr>
-        <w:t xml:space="preserve"> </w:t>
-      </w:r>
-      <w:r>
-        <w:rPr>
-          <w:sz w:val="24"/>
-        </w:rPr>
-        <w:t>color.</w:t>
-      </w:r>
-      <w:r>
-        <w:rPr>
-          <w:spacing w:val="-3"/>
-          <w:sz w:val="24"/>
-        </w:rPr>
-        <w:t xml:space="preserve"> </w:t>
-      </w:r>
-      <w:r>
-        <w:rPr>
-          <w:sz w:val="24"/>
-        </w:rPr>
-        <w:t>El</w:t>
-      </w:r>
-      <w:r>
-        <w:rPr>
-          <w:spacing w:val="-1"/>
-          <w:sz w:val="24"/>
-        </w:rPr>
-        <w:t xml:space="preserve"> </w:t>
-      </w:r>
-      <w:r>
-        <w:rPr>
-          <w:sz w:val="24"/>
-        </w:rPr>
-        <w:t>color</w:t>
-      </w:r>
-      <w:r>
-        <w:rPr>
-          <w:spacing w:val="-1"/>
-          <w:sz w:val="24"/>
-        </w:rPr>
-        <w:t xml:space="preserve"> </w:t>
-      </w:r>
-      <w:r>
-        <w:rPr>
-          <w:sz w:val="24"/>
-        </w:rPr>
-        <w:t>puede ser</w:t>
-      </w:r>
-      <w:r>
-        <w:rPr>
-          <w:spacing w:val="-2"/>
-          <w:sz w:val="24"/>
-        </w:rPr>
-        <w:t xml:space="preserve"> </w:t>
-      </w:r>
-      <w:r>
-        <w:rPr>
-          <w:sz w:val="24"/>
-        </w:rPr>
-        <w:t>pleno o degradado. La imagen se puede</w:t>
-      </w:r>
-      <w:r>
-        <w:rPr>
-          <w:spacing w:val="-3"/>
-          <w:sz w:val="24"/>
-        </w:rPr>
-        <w:t xml:space="preserve"> </w:t>
-      </w:r>
-      <w:r>
-        <w:rPr>
-          <w:sz w:val="24"/>
-        </w:rPr>
-        <w:t>repetir</w:t>
-      </w:r>
-      <w:r>
-        <w:rPr>
-          <w:spacing w:val="-6"/>
-          <w:sz w:val="24"/>
-        </w:rPr>
-        <w:t xml:space="preserve"> </w:t>
-      </w:r>
-      <w:r>
-        <w:rPr>
-          <w:sz w:val="24"/>
-        </w:rPr>
-        <w:t>formando</w:t>
-      </w:r>
-      <w:r>
-        <w:rPr>
-          <w:spacing w:val="-3"/>
-          <w:sz w:val="24"/>
-        </w:rPr>
-        <w:t xml:space="preserve"> </w:t>
-      </w:r>
-      <w:r>
-        <w:rPr>
-          <w:sz w:val="24"/>
-        </w:rPr>
-        <w:t>una</w:t>
-      </w:r>
-      <w:r>
-        <w:rPr>
-          <w:spacing w:val="-3"/>
-          <w:sz w:val="24"/>
-        </w:rPr>
-        <w:t xml:space="preserve"> </w:t>
-      </w:r>
-      <w:r>
-        <w:rPr>
-          <w:sz w:val="24"/>
-        </w:rPr>
-        <w:t>trama</w:t>
-      </w:r>
-      <w:r>
-        <w:rPr>
-          <w:spacing w:val="-3"/>
-          <w:sz w:val="24"/>
-        </w:rPr>
-        <w:t xml:space="preserve"> </w:t>
-      </w:r>
-      <w:r>
-        <w:rPr>
-          <w:sz w:val="24"/>
-        </w:rPr>
-        <w:t>(es</w:t>
-      </w:r>
-      <w:r>
-        <w:rPr>
-          <w:spacing w:val="-3"/>
-          <w:sz w:val="24"/>
-        </w:rPr>
-        <w:t xml:space="preserve"> </w:t>
-      </w:r>
-      <w:r>
-        <w:rPr>
-          <w:sz w:val="24"/>
-        </w:rPr>
-        <w:t>lo</w:t>
-      </w:r>
-      <w:r>
-        <w:rPr>
-          <w:spacing w:val="-3"/>
-          <w:sz w:val="24"/>
-        </w:rPr>
-        <w:t xml:space="preserve"> </w:t>
-      </w:r>
-      <w:r>
-        <w:rPr>
-          <w:sz w:val="24"/>
-        </w:rPr>
-        <w:t>que</w:t>
-      </w:r>
-      <w:r>
-        <w:rPr>
-          <w:spacing w:val="-5"/>
-          <w:sz w:val="24"/>
-        </w:rPr>
-        <w:t xml:space="preserve"> </w:t>
-      </w:r>
-      <w:r>
-        <w:rPr>
-          <w:sz w:val="24"/>
-        </w:rPr>
-        <w:t>ocurre</w:t>
-      </w:r>
-      <w:r>
-        <w:rPr>
-          <w:spacing w:val="-3"/>
-          <w:sz w:val="24"/>
-        </w:rPr>
-        <w:t xml:space="preserve"> </w:t>
-      </w:r>
-      <w:r>
-        <w:rPr>
-          <w:sz w:val="24"/>
-        </w:rPr>
-        <w:t>por</w:t>
-      </w:r>
-      <w:r>
-        <w:rPr>
-          <w:spacing w:val="-3"/>
-          <w:sz w:val="24"/>
-        </w:rPr>
-        <w:t xml:space="preserve"> </w:t>
-      </w:r>
-      <w:r>
-        <w:rPr>
-          <w:sz w:val="24"/>
-        </w:rPr>
-        <w:t>defecto)</w:t>
-      </w:r>
-      <w:r>
-        <w:rPr>
-          <w:spacing w:val="-3"/>
-          <w:sz w:val="24"/>
-        </w:rPr>
-        <w:t xml:space="preserve"> </w:t>
-      </w:r>
-      <w:r>
-        <w:rPr>
-          <w:sz w:val="24"/>
-        </w:rPr>
-        <w:t>o</w:t>
-      </w:r>
-      <w:r>
-        <w:rPr>
-          <w:spacing w:val="-5"/>
-          <w:sz w:val="24"/>
-        </w:rPr>
-        <w:t xml:space="preserve"> </w:t>
-      </w:r>
-      <w:r>
-        <w:rPr>
-          <w:sz w:val="24"/>
-        </w:rPr>
-        <w:t>se</w:t>
-      </w:r>
-      <w:r>
-        <w:rPr>
-          <w:spacing w:val="-3"/>
-          <w:sz w:val="24"/>
-        </w:rPr>
-        <w:t xml:space="preserve"> </w:t>
-      </w:r>
-      <w:r>
-        <w:rPr>
-          <w:sz w:val="24"/>
-        </w:rPr>
-        <w:t>puede especificar que no repita y que se coloque en determinada posición.</w:t>
-      </w:r>
     </w:p>
     <w:sectPr>
-      <w:pgSz w:w="12240" w:h="15840"/>
-      <w:pgMar w:top="1340" w:right="1080" w:bottom="280" w:left="1080" w:header="720" w:footer="720" w:gutter="0"/>
+      <w:pgSz w:w="15840" w:h="12240" w:orient="landscape"/>
+      <w:pgMar w:top="1080" w:right="1340" w:bottom="1080" w:left="280" w:header="720" w:footer="720" w:gutter="0"/>
       <w:cols w:space="720"/>
+      <w:docGrid w:linePitch="299"/>
     </w:sectPr>
   </w:body>
 </w:document>
 </file>
 
 <file path=word/endnotes.xml><?xml version="1.0" encoding="utf-8"?>
-<w:endnotes xmlns:wpc="http://schemas.microsoft.com/office/word/2010/wordprocessingCanvas" xmlns:cx="http://schemas.microsoft.com/office/drawing/2014/chartex" xmlns:cx1="http://schemas.microsoft.com/office/drawing/2015/9/8/chartex" xmlns:cx2="http://schemas.microsoft.com/office/drawing/2015/10/21/chartex" xmlns:cx3="http://schemas.microsoft.com/office/drawing/2016/5/9/chartex" xmlns:cx4="http://schemas.microsoft.com/office/drawing/2016/5/10/chartex" xmlns:cx5="http://schemas.microsoft.com/office/drawing/2016/5/11/chartex" xmlns:cx6="http://schemas.microsoft.com/office/drawing/2016/5/12/chartex" xmlns:cx7="http://schemas.microsoft.com/office/drawing/2016/5/13/chartex" xmlns:cx8="http://schemas.microsoft.com/office/drawing/2016/5/14/chartex" xmlns:mc="http://schemas.openxmlformats.org/markup-compatibility/2006" xmlns:aink="http://schemas.microsoft.com/office/drawing/2016/ink" xmlns:am3d="http://schemas.microsoft.com/office/drawing/2017/model3d" xmlns:o="urn:schemas-microsoft-com:office:office" xmlns:r="http://schemas.openxmlformats.org/officeDocument/2006/relationships" xmlns:m="http://schemas.openxmlformats.org/officeDocument/2006/math" xmlns:v="urn:schemas-microsoft-com:vml" xmlns:wp14="http://schemas.microsoft.com/office/word/2010/wordprocessingDrawing" xmlns:wp="http://schemas.openxmlformats.org/drawingml/2006/wordprocessingDrawing" xmlns:w10="urn:schemas-microsoft-com:office:word" xmlns:w="http://schemas.openxmlformats.org/wordprocessingml/2006/main" xmlns:w14="http://schemas.microsoft.com/office/word/2010/wordml" xmlns:w15="http://schemas.microsoft.com/office/word/2012/wordml" xmlns:w16cex="http://schemas.microsoft.com/office/word/2018/wordml/cex" xmlns:w16cid="http://schemas.microsoft.com/office/word/2016/wordml/cid" xmlns:w16="http://schemas.microsoft.com/office/word/2018/wordml" xmlns:w16sdtdh="http://schemas.microsoft.com/office/word/2020/wordml/sdtdatahash" xmlns:w16se="http://schemas.microsoft.com/office/word/2015/wordml/symex" xmlns:wpg="http://schemas.microsoft.com/office/word/2010/wordprocessingGroup" xmlns:wpi="http://schemas.microsoft.com/office/word/2010/wordprocessingInk" xmlns:wne="http://schemas.microsoft.com/office/word/2006/wordml" xmlns:wps="http://schemas.microsoft.com/office/word/2010/wordprocessingShape" mc:Ignorable="w14 w15 w16se w16cid w16 w16cex w16sdtdh wp14">
+<w:endnotes xmlns:wpc="http://schemas.microsoft.com/office/word/2010/wordprocessingCanvas" xmlns:cx="http://schemas.microsoft.com/office/drawing/2014/chartex" xmlns:cx1="http://schemas.microsoft.com/office/drawing/2015/9/8/chartex" xmlns:cx2="http://schemas.microsoft.com/office/drawing/2015/10/21/chartex" xmlns:cx3="http://schemas.microsoft.com/office/drawing/2016/5/9/chartex" xmlns:cx4="http://schemas.microsoft.com/office/drawing/2016/5/10/chartex" xmlns:cx5="http://schemas.microsoft.com/office/drawing/2016/5/11/chartex" xmlns:cx6="http://schemas.microsoft.com/office/drawing/2016/5/12/chartex" xmlns:cx7="http://schemas.microsoft.com/office/drawing/2016/5/13/chartex" xmlns:cx8="http://schemas.microsoft.com/office/drawing/2016/5/14/chartex" xmlns:mc="http://schemas.openxmlformats.org/markup-compatibility/2006" xmlns:aink="http://schemas.microsoft.com/office/drawing/2016/ink" xmlns:am3d="http://schemas.microsoft.com/office/drawing/2017/model3d" xmlns:o="urn:schemas-microsoft-com:office:office" xmlns:oel="http://schemas.microsoft.com/office/2019/extlst" xmlns:r="http://schemas.openxmlformats.org/officeDocument/2006/relationships" xmlns:m="http://schemas.openxmlformats.org/officeDocument/2006/math" xmlns:v="urn:schemas-microsoft-com:vml" xmlns:wp14="http://schemas.microsoft.com/office/word/2010/wordprocessingDrawing" xmlns:wp="http://schemas.openxmlformats.org/drawingml/2006/wordprocessingDrawing" xmlns:w10="urn:schemas-microsoft-com:office:word" xmlns:w="http://schemas.openxmlformats.org/wordprocessingml/2006/main" xmlns:w14="http://schemas.microsoft.com/office/word/2010/wordml" xmlns:w15="http://schemas.microsoft.com/office/word/2012/wordml" xmlns:w16cex="http://schemas.microsoft.com/office/word/2018/wordml/cex" xmlns:w16cid="http://schemas.microsoft.com/office/word/2016/wordml/cid" xmlns:w16="http://schemas.microsoft.com/office/word/2018/wordml" xmlns:w16du="http://schemas.microsoft.com/office/word/2023/wordml/word16du" xmlns:w16sdtdh="http://schemas.microsoft.com/office/word/2020/wordml/sdtdatahash" xmlns:w16sdtfl="http://schemas.microsoft.com/office/word/2024/wordml/sdtformatlock" xmlns:w16se="http://schemas.microsoft.com/office/word/2015/wordml/symex" xmlns:wpg="http://schemas.microsoft.com/office/word/2010/wordprocessingGroup" xmlns:wpi="http://schemas.microsoft.com/office/word/2010/wordprocessingInk" xmlns:wne="http://schemas.microsoft.com/office/word/2006/wordml" xmlns:wps="http://schemas.microsoft.com/office/word/2010/wordprocessingShape" mc:Ignorable="w14 w15 w16se w16cid w16 w16cex w16sdtdh w16sdtfl w16du wp14">
   <w:endnote w:type="separator" w:id="-1">
     <w:p>
       <w:r>
@@ -20879,7 +20276,7 @@
 </file>
 
 <file path=word/footnotes.xml><?xml version="1.0" encoding="utf-8"?>
-<w:footnotes xmlns:wpc="http://schemas.microsoft.com/office/word/2010/wordprocessingCanvas" xmlns:cx="http://schemas.microsoft.com/office/drawing/2014/chartex" xmlns:cx1="http://schemas.microsoft.com/office/drawing/2015/9/8/chartex" xmlns:cx2="http://schemas.microsoft.com/office/drawing/2015/10/21/chartex" xmlns:cx3="http://schemas.microsoft.com/office/drawing/2016/5/9/chartex" xmlns:cx4="http://schemas.microsoft.com/office/drawing/2016/5/10/chartex" xmlns:cx5="http://schemas.microsoft.com/office/drawing/2016/5/11/chartex" xmlns:cx6="http://schemas.microsoft.com/office/drawing/2016/5/12/chartex" xmlns:cx7="http://schemas.microsoft.com/office/drawing/2016/5/13/chartex" xmlns:cx8="http://schemas.microsoft.com/office/drawing/2016/5/14/chartex" xmlns:mc="http://schemas.openxmlformats.org/markup-compatibility/2006" xmlns:aink="http://schemas.microsoft.com/office/drawing/2016/ink" xmlns:am3d="http://schemas.microsoft.com/office/drawing/2017/model3d" xmlns:o="urn:schemas-microsoft-com:office:office" xmlns:r="http://schemas.openxmlformats.org/officeDocument/2006/relationships" xmlns:m="http://schemas.openxmlformats.org/officeDocument/2006/math" xmlns:v="urn:schemas-microsoft-com:vml" xmlns:wp14="http://schemas.microsoft.com/office/word/2010/wordprocessingDrawing" xmlns:wp="http://schemas.openxmlformats.org/drawingml/2006/wordprocessingDrawing" xmlns:w10="urn:schemas-microsoft-com:office:word" xmlns:w="http://schemas.openxmlformats.org/wordprocessingml/2006/main" xmlns:w14="http://schemas.microsoft.com/office/word/2010/wordml" xmlns:w15="http://schemas.microsoft.com/office/word/2012/wordml" xmlns:w16cex="http://schemas.microsoft.com/office/word/2018/wordml/cex" xmlns:w16cid="http://schemas.microsoft.com/office/word/2016/wordml/cid" xmlns:w16="http://schemas.microsoft.com/office/word/2018/wordml" xmlns:w16sdtdh="http://schemas.microsoft.com/office/word/2020/wordml/sdtdatahash" xmlns:w16se="http://schemas.microsoft.com/office/word/2015/wordml/symex" xmlns:wpg="http://schemas.microsoft.com/office/word/2010/wordprocessingGroup" xmlns:wpi="http://schemas.microsoft.com/office/word/2010/wordprocessingInk" xmlns:wne="http://schemas.microsoft.com/office/word/2006/wordml" xmlns:wps="http://schemas.microsoft.com/office/word/2010/wordprocessingShape" mc:Ignorable="w14 w15 w16se w16cid w16 w16cex w16sdtdh wp14">
+<w:footnotes xmlns:wpc="http://schemas.microsoft.com/office/word/2010/wordprocessingCanvas" xmlns:cx="http://schemas.microsoft.com/office/drawing/2014/chartex" xmlns:cx1="http://schemas.microsoft.com/office/drawing/2015/9/8/chartex" xmlns:cx2="http://schemas.microsoft.com/office/drawing/2015/10/21/chartex" xmlns:cx3="http://schemas.microsoft.com/office/drawing/2016/5/9/chartex" xmlns:cx4="http://schemas.microsoft.com/office/drawing/2016/5/10/chartex" xmlns:cx5="http://schemas.microsoft.com/office/drawing/2016/5/11/chartex" xmlns:cx6="http://schemas.microsoft.com/office/drawing/2016/5/12/chartex" xmlns:cx7="http://schemas.microsoft.com/office/drawing/2016/5/13/chartex" xmlns:cx8="http://schemas.microsoft.com/office/drawing/2016/5/14/chartex" xmlns:mc="http://schemas.openxmlformats.org/markup-compatibility/2006" xmlns:aink="http://schemas.microsoft.com/office/drawing/2016/ink" xmlns:am3d="http://schemas.microsoft.com/office/drawing/2017/model3d" xmlns:o="urn:schemas-microsoft-com:office:office" xmlns:oel="http://schemas.microsoft.com/office/2019/extlst" xmlns:r="http://schemas.openxmlformats.org/officeDocument/2006/relationships" xmlns:m="http://schemas.openxmlformats.org/officeDocument/2006/math" xmlns:v="urn:schemas-microsoft-com:vml" xmlns:wp14="http://schemas.microsoft.com/office/word/2010/wordprocessingDrawing" xmlns:wp="http://schemas.openxmlformats.org/drawingml/2006/wordprocessingDrawing" xmlns:w10="urn:schemas-microsoft-com:office:word" xmlns:w="http://schemas.openxmlformats.org/wordprocessingml/2006/main" xmlns:w14="http://schemas.microsoft.com/office/word/2010/wordml" xmlns:w15="http://schemas.microsoft.com/office/word/2012/wordml" xmlns:w16cex="http://schemas.microsoft.com/office/word/2018/wordml/cex" xmlns:w16cid="http://schemas.microsoft.com/office/word/2016/wordml/cid" xmlns:w16="http://schemas.microsoft.com/office/word/2018/wordml" xmlns:w16du="http://schemas.microsoft.com/office/word/2023/wordml/word16du" xmlns:w16sdtdh="http://schemas.microsoft.com/office/word/2020/wordml/sdtdatahash" xmlns:w16sdtfl="http://schemas.microsoft.com/office/word/2024/wordml/sdtformatlock" xmlns:w16se="http://schemas.microsoft.com/office/word/2015/wordml/symex" xmlns:wpg="http://schemas.microsoft.com/office/word/2010/wordprocessingGroup" xmlns:wpi="http://schemas.microsoft.com/office/word/2010/wordprocessingInk" xmlns:wne="http://schemas.microsoft.com/office/word/2006/wordml" xmlns:wps="http://schemas.microsoft.com/office/word/2010/wordprocessingShape" mc:Ignorable="w14 w15 w16se w16cid w16 w16cex w16sdtdh w16sdtfl w16du wp14">
   <w:footnote w:type="separator" w:id="-1">
     <w:p>
       <w:r>
@@ -20898,7 +20295,7 @@
 </file>
 
 <file path=word/numbering.xml><?xml version="1.0" encoding="utf-8"?>
-<w:numbering xmlns:wpc="http://schemas.microsoft.com/office/word/2010/wordprocessingCanvas" xmlns:cx="http://schemas.microsoft.com/office/drawing/2014/chartex" xmlns:cx1="http://schemas.microsoft.com/office/drawing/2015/9/8/chartex" xmlns:cx2="http://schemas.microsoft.com/office/drawing/2015/10/21/chartex" xmlns:cx3="http://schemas.microsoft.com/office/drawing/2016/5/9/chartex" xmlns:cx4="http://schemas.microsoft.com/office/drawing/2016/5/10/chartex" xmlns:cx5="http://schemas.microsoft.com/office/drawing/2016/5/11/chartex" xmlns:cx6="http://schemas.microsoft.com/office/drawing/2016/5/12/chartex" xmlns:cx7="http://schemas.microsoft.com/office/drawing/2016/5/13/chartex" xmlns:cx8="http://schemas.microsoft.com/office/drawing/2016/5/14/chartex" xmlns:mc="http://schemas.openxmlformats.org/markup-compatibility/2006" xmlns:aink="http://schemas.microsoft.com/office/drawing/2016/ink" xmlns:am3d="http://schemas.microsoft.com/office/drawing/2017/model3d" xmlns:o="urn:schemas-microsoft-com:office:office" xmlns:r="http://schemas.openxmlformats.org/officeDocument/2006/relationships" xmlns:m="http://schemas.openxmlformats.org/officeDocument/2006/math" xmlns:v="urn:schemas-microsoft-com:vml" xmlns:wp14="http://schemas.microsoft.com/office/word/2010/wordprocessingDrawing" xmlns:wp="http://schemas.openxmlformats.org/drawingml/2006/wordprocessingDrawing" xmlns:w10="urn:schemas-microsoft-com:office:word" xmlns:w="http://schemas.openxmlformats.org/wordprocessingml/2006/main" xmlns:w14="http://schemas.microsoft.com/office/word/2010/wordml" xmlns:w15="http://schemas.microsoft.com/office/word/2012/wordml" xmlns:w16cex="http://schemas.microsoft.com/office/word/2018/wordml/cex" xmlns:w16cid="http://schemas.microsoft.com/office/word/2016/wordml/cid" xmlns:w16="http://schemas.microsoft.com/office/word/2018/wordml" xmlns:w16sdtdh="http://schemas.microsoft.com/office/word/2020/wordml/sdtdatahash" xmlns:w16se="http://schemas.microsoft.com/office/word/2015/wordml/symex" xmlns:wpg="http://schemas.microsoft.com/office/word/2010/wordprocessingGroup" xmlns:wpi="http://schemas.microsoft.com/office/word/2010/wordprocessingInk" xmlns:wne="http://schemas.microsoft.com/office/word/2006/wordml" xmlns:wps="http://schemas.microsoft.com/office/word/2010/wordprocessingShape" mc:Ignorable="w14 w15 w16se w16cid w16 w16cex w16sdtdh wp14">
+<w:numbering xmlns:wpc="http://schemas.microsoft.com/office/word/2010/wordprocessingCanvas" xmlns:cx="http://schemas.microsoft.com/office/drawing/2014/chartex" xmlns:cx1="http://schemas.microsoft.com/office/drawing/2015/9/8/chartex" xmlns:cx2="http://schemas.microsoft.com/office/drawing/2015/10/21/chartex" xmlns:cx3="http://schemas.microsoft.com/office/drawing/2016/5/9/chartex" xmlns:cx4="http://schemas.microsoft.com/office/drawing/2016/5/10/chartex" xmlns:cx5="http://schemas.microsoft.com/office/drawing/2016/5/11/chartex" xmlns:cx6="http://schemas.microsoft.com/office/drawing/2016/5/12/chartex" xmlns:cx7="http://schemas.microsoft.com/office/drawing/2016/5/13/chartex" xmlns:cx8="http://schemas.microsoft.com/office/drawing/2016/5/14/chartex" xmlns:mc="http://schemas.openxmlformats.org/markup-compatibility/2006" xmlns:aink="http://schemas.microsoft.com/office/drawing/2016/ink" xmlns:am3d="http://schemas.microsoft.com/office/drawing/2017/model3d" xmlns:o="urn:schemas-microsoft-com:office:office" xmlns:oel="http://schemas.microsoft.com/office/2019/extlst" xmlns:r="http://schemas.openxmlformats.org/officeDocument/2006/relationships" xmlns:m="http://schemas.openxmlformats.org/officeDocument/2006/math" xmlns:v="urn:schemas-microsoft-com:vml" xmlns:wp14="http://schemas.microsoft.com/office/word/2010/wordprocessingDrawing" xmlns:wp="http://schemas.openxmlformats.org/drawingml/2006/wordprocessingDrawing" xmlns:w10="urn:schemas-microsoft-com:office:word" xmlns:w="http://schemas.openxmlformats.org/wordprocessingml/2006/main" xmlns:w14="http://schemas.microsoft.com/office/word/2010/wordml" xmlns:w15="http://schemas.microsoft.com/office/word/2012/wordml" xmlns:w16cex="http://schemas.microsoft.com/office/word/2018/wordml/cex" xmlns:w16cid="http://schemas.microsoft.com/office/word/2016/wordml/cid" xmlns:w16="http://schemas.microsoft.com/office/word/2018/wordml" xmlns:w16du="http://schemas.microsoft.com/office/word/2023/wordml/word16du" xmlns:w16sdtdh="http://schemas.microsoft.com/office/word/2020/wordml/sdtdatahash" xmlns:w16sdtfl="http://schemas.microsoft.com/office/word/2024/wordml/sdtformatlock" xmlns:w16se="http://schemas.microsoft.com/office/word/2015/wordml/symex" xmlns:wpg="http://schemas.microsoft.com/office/word/2010/wordprocessingGroup" xmlns:wpi="http://schemas.microsoft.com/office/word/2010/wordprocessingInk" xmlns:wne="http://schemas.microsoft.com/office/word/2006/wordml" xmlns:wps="http://schemas.microsoft.com/office/word/2010/wordprocessingShape" mc:Ignorable="w14 w15 w16se w16cid w16 w16cex w16sdtdh w16sdtfl w16du wp14">
   <w:abstractNum w:abstractNumId="0" w15:restartNumberingAfterBreak="0">
     <w:nsid w:val="14634548"/>
     <w:multiLevelType w:val="hybridMultilevel"/>
@@ -21586,32 +20983,32 @@
       </w:rPr>
     </w:lvl>
   </w:abstractNum>
-  <w:num w:numId="1">
+  <w:num w:numId="1" w16cid:durableId="1190535689">
     <w:abstractNumId w:val="4"/>
   </w:num>
-  <w:num w:numId="2">
+  <w:num w:numId="2" w16cid:durableId="1395397582">
     <w:abstractNumId w:val="6"/>
   </w:num>
-  <w:num w:numId="3">
+  <w:num w:numId="3" w16cid:durableId="294987728">
     <w:abstractNumId w:val="0"/>
   </w:num>
-  <w:num w:numId="4">
+  <w:num w:numId="4" w16cid:durableId="572592098">
     <w:abstractNumId w:val="3"/>
   </w:num>
-  <w:num w:numId="5">
+  <w:num w:numId="5" w16cid:durableId="2022925578">
     <w:abstractNumId w:val="1"/>
   </w:num>
-  <w:num w:numId="6">
+  <w:num w:numId="6" w16cid:durableId="557860220">
     <w:abstractNumId w:val="2"/>
   </w:num>
-  <w:num w:numId="7">
+  <w:num w:numId="7" w16cid:durableId="2084208214">
     <w:abstractNumId w:val="5"/>
   </w:num>
 </w:numbering>
 </file>
 
 <file path=word/styles.xml><?xml version="1.0" encoding="utf-8"?>
-<w:styles xmlns:mc="http://schemas.openxmlformats.org/markup-compatibility/2006" xmlns:r="http://schemas.openxmlformats.org/officeDocument/2006/relationships" xmlns:w="http://schemas.openxmlformats.org/wordprocessingml/2006/main" xmlns:w14="http://schemas.microsoft.com/office/word/2010/wordml" xmlns:w15="http://schemas.microsoft.com/office/word/2012/wordml" xmlns:w16cex="http://schemas.microsoft.com/office/word/2018/wordml/cex" xmlns:w16cid="http://schemas.microsoft.com/office/word/2016/wordml/cid" xmlns:w16="http://schemas.microsoft.com/office/word/2018/wordml" xmlns:w16sdtdh="http://schemas.microsoft.com/office/word/2020/wordml/sdtdatahash" xmlns:w16se="http://schemas.microsoft.com/office/word/2015/wordml/symex" mc:Ignorable="w14 w15 w16se w16cid w16 w16cex w16sdtdh">
+<w:styles xmlns:mc="http://schemas.openxmlformats.org/markup-compatibility/2006" xmlns:r="http://schemas.openxmlformats.org/officeDocument/2006/relationships" xmlns:w="http://schemas.openxmlformats.org/wordprocessingml/2006/main" xmlns:w14="http://schemas.microsoft.com/office/word/2010/wordml" xmlns:w15="http://schemas.microsoft.com/office/word/2012/wordml" xmlns:w16cex="http://schemas.microsoft.com/office/word/2018/wordml/cex" xmlns:w16cid="http://schemas.microsoft.com/office/word/2016/wordml/cid" xmlns:w16="http://schemas.microsoft.com/office/word/2018/wordml" xmlns:w16du="http://schemas.microsoft.com/office/word/2023/wordml/word16du" xmlns:w16sdtdh="http://schemas.microsoft.com/office/word/2020/wordml/sdtdatahash" xmlns:w16sdtfl="http://schemas.microsoft.com/office/word/2024/wordml/sdtformatlock" xmlns:w16se="http://schemas.microsoft.com/office/word/2015/wordml/symex" mc:Ignorable="w14 w15 w16se w16cid w16 w16cex w16sdtdh w16sdtfl w16du">
   <w:docDefaults>
     <w:rPrDefault>
       <w:rPr>
@@ -22200,7 +21597,7 @@
       <w:lang w:val="es-CO" w:eastAsia="es-CO"/>
     </w:rPr>
   </w:style>
-  <w:style w:type="character" w:styleId="Textoennegrita">
+  <w:style w:type="character" w:styleId="Fuerte">
     <w:name w:val="Strong"/>
     <w:basedOn w:val="Fuentedeprrafopredeter"/>
     <w:uiPriority w:val="22"/>

</xml_diff>